<commit_message>
Inclusao da versão final enviada e em dois arquivos do sistema
</commit_message>
<xml_diff>
--- a/TCC/Detalhamento do sistema.docx
+++ b/TCC/Detalhamento do sistema.docx
@@ -152,13 +152,7 @@
         <w:rPr>
           <w:color w:val="538135" w:themeColor="accent6" w:themeShade="BF"/>
         </w:rPr>
-        <w:t>Nova solicitação (foto, número do protocolo, data do registro, endereço relacionado ao requerimento, descrição do requerimento, situação do requerimento (registrada, direcionada (pelo cidadão), distribuída (por outra UG), delegada para análise, em análise, em execução, concluída</w:t>
-      </w:r>
-      <w:r>
-        <w:rPr>
-          <w:color w:val="538135" w:themeColor="accent6" w:themeShade="BF"/>
-        </w:rPr>
-        <w:t xml:space="preserve"> (para resposta, para nova distribuição)</w:t>
+        <w:t>Nova solicitação (foto, número do protocolo, data do registro, endereço relacionado ao requerimento, descrição do requerimento, situação do requerimento (registrada, direcionada (pelo cidadão), distribuída (por outra UG), delegada para análise, em análise, em execução, concluída (para resposta, para nova distribuição)</w:t>
       </w:r>
       <w:r>
         <w:rPr>
@@ -365,13 +359,7 @@
         <w:rPr>
           <w:color w:val="EE0000"/>
         </w:rPr>
-        <w:t xml:space="preserve">) </w:t>
-      </w:r>
-      <w:r>
-        <w:rPr>
-          <w:color w:val="EE0000"/>
-        </w:rPr>
-        <w:t xml:space="preserve">com filtros como: </w:t>
+        <w:t xml:space="preserve">) com filtros como: </w:t>
       </w:r>
       <w:r>
         <w:rPr>
@@ -524,10 +512,7 @@
         <w:t xml:space="preserve"> servidor</w:t>
       </w:r>
       <w:r>
-        <w:t xml:space="preserve"> </w:t>
-      </w:r>
-      <w:r>
-        <w:t>(</w:t>
+        <w:t xml:space="preserve"> (</w:t>
       </w:r>
       <w:r>
         <w:t>A</w:t>
@@ -663,16 +648,8 @@
         <w:rPr>
           <w:color w:val="EE0000"/>
         </w:rPr>
-        <w:t xml:space="preserve">um requerimento para ser tratada por uma UG. Só podem ser distribuídos requerimentos que estejam com a </w:t>
-      </w:r>
-      <w:proofErr w:type="gramStart"/>
-      <w:r>
-        <w:rPr>
-          <w:color w:val="EE0000"/>
-        </w:rPr>
-        <w:t>situação Registrado</w:t>
-      </w:r>
-      <w:proofErr w:type="gramEnd"/>
+        <w:t>um requerimento para ser tratada por uma UG. Só podem ser distribuídos requerimentos que estejam com a situação Registrado</w:t>
+      </w:r>
     </w:p>
     <w:p>
       <w:pPr>
@@ -869,13 +846,7 @@
         <w:rPr>
           <w:color w:val="EE0000"/>
         </w:rPr>
-        <w:t xml:space="preserve"> </w:t>
-      </w:r>
-      <w:r>
-        <w:rPr>
-          <w:color w:val="EE0000"/>
-        </w:rPr>
-        <w:t>(exclui os Respondidos e Avaliados)</w:t>
+        <w:t xml:space="preserve"> (exclui os Respondidos e Avaliados)</w:t>
       </w:r>
       <w:r>
         <w:rPr>
@@ -931,21 +902,10 @@
         <w:t xml:space="preserve">abertos </w:t>
       </w:r>
       <w:r>
-        <w:t xml:space="preserve">por </w:t>
-      </w:r>
-      <w:proofErr w:type="gramStart"/>
-      <w:r>
-        <w:t>bairro</w:t>
-      </w:r>
-      <w:r>
-        <w:t xml:space="preserve"> </w:t>
-      </w:r>
-      <w:r>
-        <w:t xml:space="preserve"> (</w:t>
-      </w:r>
-      <w:proofErr w:type="gramEnd"/>
-      <w:r>
-        <w:t>exclui os Respondidos e Avaliados)</w:t>
+        <w:t>por bairro</w:t>
+      </w:r>
+      <w:r>
+        <w:t xml:space="preserve">  (exclui os Respondidos e Avaliados)</w:t>
       </w:r>
       <w:r>
         <w:t>.</w:t>
@@ -990,16 +950,7 @@
         <w:jc w:val="both"/>
       </w:pPr>
       <w:r>
-        <w:t xml:space="preserve">de barra com as 10 unidades gestoras com </w:t>
-      </w:r>
-      <w:r>
-        <w:t>menor</w:t>
-      </w:r>
-      <w:r>
-        <w:t xml:space="preserve"> percentual de requerimentos encerrados nos últimos 30 dias</w:t>
-      </w:r>
-      <w:r>
-        <w:t>.</w:t>
+        <w:t>de barra com as 10 unidades gestoras com menor percentual de requerimentos encerrados nos últimos 30 dias.</w:t>
       </w:r>
     </w:p>
     <w:p>
@@ -1079,31 +1030,7 @@
         <w:rPr>
           <w:color w:val="EE0000"/>
         </w:rPr>
-        <w:t xml:space="preserve">requerimentos com situação </w:t>
-      </w:r>
-      <w:r>
-        <w:rPr>
-          <w:color w:val="EE0000"/>
-        </w:rPr>
-        <w:t xml:space="preserve">Distribuído </w:t>
-      </w:r>
-      <w:r>
-        <w:rPr>
-          <w:color w:val="EE0000"/>
-        </w:rPr>
-        <w:t>e</w:t>
-      </w:r>
-      <w:r>
-        <w:rPr>
-          <w:color w:val="EE0000"/>
-        </w:rPr>
-        <w:t xml:space="preserve"> Direcionado e</w:t>
-      </w:r>
-      <w:r>
-        <w:rPr>
-          <w:color w:val="EE0000"/>
-        </w:rPr>
-        <w:t xml:space="preserve"> possibilita o </w:t>
+        <w:t xml:space="preserve">requerimentos com situação Distribuído e Direcionado e possibilita o </w:t>
       </w:r>
       <w:r>
         <w:rPr>
@@ -1178,19 +1105,7 @@
         <w:t>Distribuir solicitação</w:t>
       </w:r>
       <w:r>
-        <w:t xml:space="preserve"> (</w:t>
-      </w:r>
-      <w:r>
-        <w:t>registra</w:t>
-      </w:r>
-      <w:r>
-        <w:t xml:space="preserve"> </w:t>
-      </w:r>
-      <w:r>
-        <w:t>a movimentação</w:t>
-      </w:r>
-      <w:r>
-        <w:t>)</w:t>
+        <w:t xml:space="preserve"> (registra a movimentação)</w:t>
       </w:r>
     </w:p>
     <w:p>
@@ -1234,13 +1149,7 @@
         <w:rPr>
           <w:color w:val="EE0000"/>
         </w:rPr>
-        <w:t xml:space="preserve">requerimentos com situação </w:t>
-      </w:r>
-      <w:r>
-        <w:rPr>
-          <w:color w:val="EE0000"/>
-        </w:rPr>
-        <w:t xml:space="preserve">Concluído para que possam </w:t>
+        <w:t xml:space="preserve">requerimentos com situação Concluído para que possam </w:t>
       </w:r>
       <w:r>
         <w:rPr>
@@ -1270,13 +1179,7 @@
         <w:rPr>
           <w:color w:val="EE0000"/>
         </w:rPr>
-        <w:t>registra a movimentação</w:t>
-      </w:r>
-      <w:r>
-        <w:rPr>
-          <w:color w:val="EE0000"/>
-        </w:rPr>
-        <w:t xml:space="preserve"> e muda a situação</w:t>
+        <w:t>registra a movimentação e muda a situação</w:t>
       </w:r>
       <w:r>
         <w:rPr>
@@ -1329,15 +1232,7 @@
           <w:bCs/>
           <w:color w:val="EE0000"/>
         </w:rPr>
-        <w:t>Dashboard d</w:t>
-      </w:r>
-      <w:r>
-        <w:rPr>
-          <w:b/>
-          <w:bCs/>
-          <w:color w:val="EE0000"/>
-        </w:rPr>
-        <w:t>a UG</w:t>
+        <w:t>Dashboard da UG</w:t>
       </w:r>
       <w:r>
         <w:rPr>
@@ -1421,13 +1316,7 @@
         </w:numPr>
       </w:pPr>
       <w:r>
-        <w:t>Planejar execução (</w:t>
-      </w:r>
-      <w:r>
-        <w:t>só solicitações com situação</w:t>
-      </w:r>
-      <w:r>
-        <w:t xml:space="preserve"> “Em análise”, quando mudam para “Em execução”)</w:t>
+        <w:t>Planejar execução (só solicitações com situação “Em análise”, quando mudam para “Em execução”)</w:t>
       </w:r>
     </w:p>
     <w:p>
@@ -1465,21 +1354,7 @@
         <w:rPr>
           <w:color w:val="EE0000"/>
         </w:rPr>
-        <w:t xml:space="preserve">Para resposta, </w:t>
-      </w:r>
-      <w:proofErr w:type="gramStart"/>
-      <w:r>
-        <w:rPr>
-          <w:color w:val="EE0000"/>
-        </w:rPr>
-        <w:t>Para</w:t>
-      </w:r>
-      <w:proofErr w:type="gramEnd"/>
-      <w:r>
-        <w:rPr>
-          <w:color w:val="EE0000"/>
-        </w:rPr>
-        <w:t xml:space="preserve"> nova distribuição</w:t>
+        <w:t>Para resposta, Para nova distribuição</w:t>
       </w:r>
       <w:r>
         <w:rPr>
@@ -1509,15 +1384,7 @@
         </w:numPr>
       </w:pPr>
       <w:r>
-        <w:t>Cancelar conclusão de solicitação (</w:t>
-      </w:r>
-      <w:proofErr w:type="gramStart"/>
-      <w:r>
-        <w:t>só Concluídas</w:t>
-      </w:r>
-      <w:proofErr w:type="gramEnd"/>
-      <w:r>
-        <w:t>)</w:t>
+        <w:t>Cancelar conclusão de solicitação (só Concluídas)</w:t>
       </w:r>
     </w:p>
     <w:p>
@@ -1561,310 +1428,354 @@
         <w:t>Cidadão:</w:t>
       </w:r>
       <w:r>
+        <w:t xml:space="preserve"> nome, CPF, endereço, bairro, CEP, ponto de referência, e-mail, foto</w:t>
+      </w:r>
+    </w:p>
+    <w:p>
+      <w:r>
+        <w:rPr>
+          <w:b/>
+          <w:bCs/>
+        </w:rPr>
+        <w:t>Solicitação:</w:t>
+      </w:r>
+      <w:r>
         <w:t xml:space="preserve"> </w:t>
       </w:r>
-      <w:r>
-        <w:t>nome, CPF, endereço, bairro, CEP, ponto de referência, e-mail, foto</w:t>
-      </w:r>
-    </w:p>
-    <w:p>
-      <w:r>
-        <w:rPr>
-          <w:b/>
-          <w:bCs/>
-        </w:rPr>
-        <w:t>Solicitação:</w:t>
+      <w:proofErr w:type="spellStart"/>
+      <w:r>
+        <w:t>usuarioID</w:t>
+      </w:r>
+      <w:proofErr w:type="spellEnd"/>
+      <w:r>
+        <w:t xml:space="preserve">, categoria, </w:t>
+      </w:r>
+      <w:proofErr w:type="spellStart"/>
+      <w:r>
+        <w:t>dataAtualizacao</w:t>
+      </w:r>
+      <w:proofErr w:type="spellEnd"/>
+      <w:r>
+        <w:t xml:space="preserve">, </w:t>
+      </w:r>
+      <w:proofErr w:type="spellStart"/>
+      <w:r>
+        <w:t>dataCadastro</w:t>
+      </w:r>
+      <w:proofErr w:type="spellEnd"/>
+      <w:r>
+        <w:t xml:space="preserve">, </w:t>
+      </w:r>
+      <w:proofErr w:type="spellStart"/>
+      <w:r>
+        <w:t>descricao</w:t>
+      </w:r>
+      <w:proofErr w:type="spellEnd"/>
+      <w:r>
+        <w:t xml:space="preserve">, </w:t>
+      </w:r>
+      <w:proofErr w:type="spellStart"/>
+      <w:r>
+        <w:t>endereco</w:t>
+      </w:r>
+      <w:proofErr w:type="spellEnd"/>
+      <w:r>
+        <w:t xml:space="preserve">, </w:t>
+      </w:r>
+      <w:r>
+        <w:t>foto</w:t>
+      </w:r>
+      <w:r>
+        <w:t>s</w:t>
+      </w:r>
+      <w:r>
+        <w:t xml:space="preserve">, </w:t>
+      </w:r>
+      <w:proofErr w:type="spellStart"/>
+      <w:r>
+        <w:t>fotosCount</w:t>
+      </w:r>
+      <w:proofErr w:type="spellEnd"/>
+      <w:r>
+        <w:t>, protocolo, resposta</w:t>
+      </w:r>
+      <w:r>
+        <w:rPr>
+          <w:color w:val="EE0000"/>
+        </w:rPr>
+        <w:t>s</w:t>
+      </w:r>
+      <w:r>
+        <w:t>, status</w:t>
+      </w:r>
+      <w:r>
+        <w:t xml:space="preserve"> (registrada, direcionada (pelo cidadão), distribuída (por outra UG), delegada para análise, em análise, em execução, concluída (para resposta, para nova distribuição)</w:t>
+      </w:r>
+      <w:r>
+        <w:t>,</w:t>
+      </w:r>
+      <w:r>
+        <w:t xml:space="preserve"> respondida</w:t>
+      </w:r>
+      <w:r>
+        <w:t xml:space="preserve"> e avaliada</w:t>
+      </w:r>
+      <w:r>
+        <w:t xml:space="preserve">), </w:t>
+      </w:r>
+      <w:r>
+        <w:rPr>
+          <w:color w:val="EE0000"/>
+        </w:rPr>
+        <w:t>documentos anexos ao requerimento</w:t>
+      </w:r>
+      <w:r>
+        <w:t xml:space="preserve">, </w:t>
+      </w:r>
+      <w:proofErr w:type="spellStart"/>
+      <w:r>
+        <w:rPr>
+          <w:color w:val="EE0000"/>
+        </w:rPr>
+        <w:t>ugResponsavel</w:t>
+      </w:r>
+      <w:proofErr w:type="spellEnd"/>
+      <w:r>
+        <w:t xml:space="preserve">, </w:t>
+      </w:r>
+      <w:proofErr w:type="spellStart"/>
+      <w:r>
+        <w:t>servidor</w:t>
+      </w:r>
+      <w:r>
+        <w:t>R</w:t>
+      </w:r>
+      <w:r>
+        <w:t>espons</w:t>
+      </w:r>
+      <w:r>
+        <w:t>a</w:t>
+      </w:r>
+      <w:r>
+        <w:t>vel</w:t>
+      </w:r>
+      <w:proofErr w:type="spellEnd"/>
+      <w:r>
+        <w:t xml:space="preserve">, </w:t>
+      </w:r>
+      <w:proofErr w:type="spellStart"/>
+      <w:r>
+        <w:rPr>
+          <w:color w:val="EE0000"/>
+        </w:rPr>
+        <w:t>data</w:t>
+      </w:r>
+      <w:r>
+        <w:rPr>
+          <w:color w:val="EE0000"/>
+        </w:rPr>
+        <w:t>C</w:t>
+      </w:r>
+      <w:r>
+        <w:rPr>
+          <w:color w:val="EE0000"/>
+        </w:rPr>
+        <w:t>onclus</w:t>
+      </w:r>
+      <w:r>
+        <w:rPr>
+          <w:color w:val="EE0000"/>
+        </w:rPr>
+        <w:t>a</w:t>
+      </w:r>
+      <w:r>
+        <w:rPr>
+          <w:color w:val="EE0000"/>
+        </w:rPr>
+        <w:t>o</w:t>
+      </w:r>
+      <w:r>
+        <w:rPr>
+          <w:color w:val="EE0000"/>
+        </w:rPr>
+        <w:t>P</w:t>
+      </w:r>
+      <w:r>
+        <w:rPr>
+          <w:color w:val="EE0000"/>
+        </w:rPr>
+        <w:t>revista</w:t>
+      </w:r>
+      <w:proofErr w:type="spellEnd"/>
+      <w:r>
+        <w:t xml:space="preserve">, </w:t>
+      </w:r>
+      <w:proofErr w:type="spellStart"/>
+      <w:r>
+        <w:rPr>
+          <w:color w:val="EE0000"/>
+        </w:rPr>
+        <w:t>data</w:t>
+      </w:r>
+      <w:r>
+        <w:rPr>
+          <w:color w:val="EE0000"/>
+        </w:rPr>
+        <w:t>C</w:t>
+      </w:r>
+      <w:r>
+        <w:rPr>
+          <w:color w:val="EE0000"/>
+        </w:rPr>
+        <w:t>onclus</w:t>
+      </w:r>
+      <w:r>
+        <w:rPr>
+          <w:color w:val="EE0000"/>
+        </w:rPr>
+        <w:t>a</w:t>
+      </w:r>
+      <w:r>
+        <w:rPr>
+          <w:color w:val="EE0000"/>
+        </w:rPr>
+        <w:t>o</w:t>
+      </w:r>
+      <w:proofErr w:type="spellEnd"/>
+      <w:r>
+        <w:t xml:space="preserve">, </w:t>
+      </w:r>
+      <w:proofErr w:type="spellStart"/>
+      <w:r>
+        <w:rPr>
+          <w:color w:val="EE0000"/>
+        </w:rPr>
+        <w:t>documento</w:t>
+      </w:r>
+      <w:r>
+        <w:rPr>
+          <w:color w:val="EE0000"/>
+        </w:rPr>
+        <w:t>R</w:t>
+      </w:r>
+      <w:r>
+        <w:rPr>
+          <w:color w:val="EE0000"/>
+        </w:rPr>
+        <w:t>esposta</w:t>
+      </w:r>
+      <w:proofErr w:type="spellEnd"/>
+      <w:r>
+        <w:t xml:space="preserve">, </w:t>
+      </w:r>
+      <w:r>
+        <w:rPr>
+          <w:color w:val="EE0000"/>
+        </w:rPr>
+        <w:t>avaliação</w:t>
+      </w:r>
+      <w:r>
+        <w:t xml:space="preserve">, </w:t>
+      </w:r>
+      <w:r>
+        <w:rPr>
+          <w:color w:val="EE0000"/>
+        </w:rPr>
+        <w:t>comentário avaliação</w:t>
+      </w:r>
+    </w:p>
+    <w:p>
+      <w:r>
+        <w:rPr>
+          <w:b/>
+          <w:bCs/>
+        </w:rPr>
+        <w:t>Comentário:</w:t>
+      </w:r>
+      <w:r>
+        <w:t xml:space="preserve"> número do protocolo, comentário, lido</w:t>
+      </w:r>
+    </w:p>
+    <w:p>
+      <w:proofErr w:type="spellStart"/>
+      <w:r>
+        <w:rPr>
+          <w:b/>
+          <w:bCs/>
+        </w:rPr>
+        <w:t>usuario</w:t>
+      </w:r>
+      <w:r>
+        <w:rPr>
+          <w:b/>
+          <w:bCs/>
+        </w:rPr>
+        <w:t>Servidor</w:t>
+      </w:r>
+      <w:proofErr w:type="spellEnd"/>
+      <w:r>
+        <w:rPr>
+          <w:b/>
+          <w:bCs/>
+        </w:rPr>
+        <w:t>:</w:t>
+      </w:r>
+      <w:r>
+        <w:t xml:space="preserve"> nome, CPF, e-mail, unidade gestora, foto</w:t>
+      </w:r>
+    </w:p>
+    <w:p>
+      <w:proofErr w:type="spellStart"/>
+      <w:r>
+        <w:rPr>
+          <w:b/>
+          <w:bCs/>
+        </w:rPr>
+        <w:t>usuarioPerfil</w:t>
+      </w:r>
+      <w:proofErr w:type="spellEnd"/>
+      <w:r>
+        <w:rPr>
+          <w:b/>
+          <w:bCs/>
+        </w:rPr>
+        <w:t>:</w:t>
       </w:r>
       <w:r>
         <w:t xml:space="preserve"> </w:t>
       </w:r>
       <w:proofErr w:type="spellStart"/>
       <w:r>
-        <w:t>usuarioID</w:t>
+        <w:t>usuarioServidor</w:t>
       </w:r>
       <w:proofErr w:type="spellEnd"/>
       <w:r>
-        <w:t xml:space="preserve">, categoria, </w:t>
+        <w:t xml:space="preserve">, perfil, </w:t>
       </w:r>
       <w:proofErr w:type="spellStart"/>
       <w:r>
-        <w:t>dataAtualizacao</w:t>
+        <w:t>descricaoPerfil</w:t>
       </w:r>
       <w:proofErr w:type="spellEnd"/>
-      <w:r>
-        <w:t xml:space="preserve">, </w:t>
-      </w:r>
+    </w:p>
+    <w:p>
       <w:proofErr w:type="spellStart"/>
       <w:r>
-        <w:t>dataCadastro</w:t>
+        <w:rPr>
+          <w:b/>
+          <w:bCs/>
+        </w:rPr>
+        <w:t>u</w:t>
+      </w:r>
+      <w:r>
+        <w:rPr>
+          <w:b/>
+          <w:bCs/>
+        </w:rPr>
+        <w:t>nidadeGestora</w:t>
       </w:r>
       <w:proofErr w:type="spellEnd"/>
       <w:r>
-        <w:t xml:space="preserve">, </w:t>
-      </w:r>
-      <w:proofErr w:type="spellStart"/>
-      <w:r>
-        <w:t>descri</w:t>
-      </w:r>
-      <w:r>
-        <w:t>cao</w:t>
-      </w:r>
-      <w:proofErr w:type="spellEnd"/>
-      <w:r>
-        <w:t xml:space="preserve">, </w:t>
-      </w:r>
-      <w:proofErr w:type="spellStart"/>
-      <w:r>
-        <w:t>endere</w:t>
-      </w:r>
-      <w:r>
-        <w:t>co</w:t>
-      </w:r>
-      <w:proofErr w:type="spellEnd"/>
-      <w:r>
-        <w:t xml:space="preserve">, </w:t>
-      </w:r>
-      <w:r>
-        <w:t>foto</w:t>
-      </w:r>
-      <w:r>
-        <w:t>s</w:t>
-      </w:r>
-      <w:r>
-        <w:t xml:space="preserve">, </w:t>
-      </w:r>
-      <w:proofErr w:type="spellStart"/>
-      <w:r>
-        <w:t>fotosCount</w:t>
-      </w:r>
-      <w:proofErr w:type="spellEnd"/>
-      <w:r>
-        <w:t xml:space="preserve">, </w:t>
-      </w:r>
-      <w:r>
-        <w:t xml:space="preserve">protocolo, </w:t>
-      </w:r>
-      <w:r>
-        <w:t>resposta</w:t>
-      </w:r>
-      <w:r>
-        <w:rPr>
-          <w:color w:val="EE0000"/>
-        </w:rPr>
-        <w:t>s</w:t>
-      </w:r>
-      <w:r>
-        <w:t>, status</w:t>
-      </w:r>
-      <w:r>
-        <w:t xml:space="preserve"> (registrada, direcionada (pelo cidadão), distribuída (por outra UG), delegada para análise, em análise, em execução, concluída (para resposta, para nova distribuição)</w:t>
-      </w:r>
-      <w:r>
-        <w:t>,</w:t>
-      </w:r>
-      <w:r>
-        <w:t xml:space="preserve"> respondida</w:t>
-      </w:r>
-      <w:r>
-        <w:t xml:space="preserve"> e</w:t>
-      </w:r>
-      <w:r>
-        <w:t xml:space="preserve"> avaliada</w:t>
-      </w:r>
-      <w:r>
-        <w:t xml:space="preserve">), </w:t>
-      </w:r>
-      <w:r>
-        <w:rPr>
-          <w:color w:val="EE0000"/>
-        </w:rPr>
-        <w:t>documentos anexos ao requerimento</w:t>
-      </w:r>
-      <w:r>
-        <w:t xml:space="preserve">, </w:t>
-      </w:r>
-      <w:proofErr w:type="spellStart"/>
-      <w:r>
-        <w:rPr>
-          <w:color w:val="EE0000"/>
-        </w:rPr>
-        <w:t>ugResponsavel</w:t>
-      </w:r>
-      <w:proofErr w:type="spellEnd"/>
-      <w:r>
-        <w:t xml:space="preserve">, </w:t>
-      </w:r>
-      <w:proofErr w:type="spellStart"/>
-      <w:r>
-        <w:t>servidor</w:t>
-      </w:r>
-      <w:r>
-        <w:t>R</w:t>
-      </w:r>
-      <w:r>
-        <w:t>espons</w:t>
-      </w:r>
-      <w:r>
-        <w:t>a</w:t>
-      </w:r>
-      <w:r>
-        <w:t>vel</w:t>
-      </w:r>
-      <w:proofErr w:type="spellEnd"/>
-      <w:r>
-        <w:t xml:space="preserve">, </w:t>
-      </w:r>
-      <w:proofErr w:type="spellStart"/>
-      <w:r>
-        <w:rPr>
-          <w:color w:val="EE0000"/>
-        </w:rPr>
-        <w:t>data</w:t>
-      </w:r>
-      <w:r>
-        <w:rPr>
-          <w:color w:val="EE0000"/>
-        </w:rPr>
-        <w:t>C</w:t>
-      </w:r>
-      <w:r>
-        <w:rPr>
-          <w:color w:val="EE0000"/>
-        </w:rPr>
-        <w:t>onclus</w:t>
-      </w:r>
-      <w:r>
-        <w:rPr>
-          <w:color w:val="EE0000"/>
-        </w:rPr>
-        <w:t>a</w:t>
-      </w:r>
-      <w:r>
-        <w:rPr>
-          <w:color w:val="EE0000"/>
-        </w:rPr>
-        <w:t>o</w:t>
-      </w:r>
-      <w:r>
-        <w:rPr>
-          <w:color w:val="EE0000"/>
-        </w:rPr>
-        <w:t>P</w:t>
-      </w:r>
-      <w:r>
-        <w:rPr>
-          <w:color w:val="EE0000"/>
-        </w:rPr>
-        <w:t>revista</w:t>
-      </w:r>
-      <w:proofErr w:type="spellEnd"/>
-      <w:r>
-        <w:t xml:space="preserve">, </w:t>
-      </w:r>
-      <w:proofErr w:type="spellStart"/>
-      <w:r>
-        <w:rPr>
-          <w:color w:val="EE0000"/>
-        </w:rPr>
-        <w:t>data</w:t>
-      </w:r>
-      <w:r>
-        <w:rPr>
-          <w:color w:val="EE0000"/>
-        </w:rPr>
-        <w:t>C</w:t>
-      </w:r>
-      <w:r>
-        <w:rPr>
-          <w:color w:val="EE0000"/>
-        </w:rPr>
-        <w:t>onclus</w:t>
-      </w:r>
-      <w:r>
-        <w:rPr>
-          <w:color w:val="EE0000"/>
-        </w:rPr>
-        <w:t>a</w:t>
-      </w:r>
-      <w:r>
-        <w:rPr>
-          <w:color w:val="EE0000"/>
-        </w:rPr>
-        <w:t>o</w:t>
-      </w:r>
-      <w:proofErr w:type="spellEnd"/>
-      <w:r>
-        <w:t xml:space="preserve">, </w:t>
-      </w:r>
-      <w:proofErr w:type="spellStart"/>
-      <w:r>
-        <w:rPr>
-          <w:color w:val="EE0000"/>
-        </w:rPr>
-        <w:t>documento</w:t>
-      </w:r>
-      <w:r>
-        <w:rPr>
-          <w:color w:val="EE0000"/>
-        </w:rPr>
-        <w:t>R</w:t>
-      </w:r>
-      <w:r>
-        <w:rPr>
-          <w:color w:val="EE0000"/>
-        </w:rPr>
-        <w:t>esposta</w:t>
-      </w:r>
-      <w:proofErr w:type="spellEnd"/>
-      <w:r>
-        <w:t xml:space="preserve">, </w:t>
-      </w:r>
-      <w:r>
-        <w:rPr>
-          <w:color w:val="EE0000"/>
-        </w:rPr>
-        <w:t>avaliação</w:t>
-      </w:r>
-      <w:r>
-        <w:t xml:space="preserve">, </w:t>
-      </w:r>
-      <w:r>
-        <w:rPr>
-          <w:color w:val="EE0000"/>
-        </w:rPr>
-        <w:t>comentário avaliação</w:t>
-      </w:r>
-    </w:p>
-    <w:p>
-      <w:r>
-        <w:rPr>
-          <w:b/>
-          <w:bCs/>
-        </w:rPr>
-        <w:t>Comentário:</w:t>
-      </w:r>
-      <w:r>
-        <w:t xml:space="preserve"> número do protocolo, comentário, lido</w:t>
-      </w:r>
-    </w:p>
-    <w:p>
-      <w:proofErr w:type="spellStart"/>
-      <w:r>
-        <w:rPr>
-          <w:b/>
-          <w:bCs/>
-        </w:rPr>
-        <w:t>usuario</w:t>
-      </w:r>
-      <w:r>
-        <w:rPr>
-          <w:b/>
-          <w:bCs/>
-        </w:rPr>
-        <w:t>Servidor</w:t>
-      </w:r>
-      <w:proofErr w:type="spellEnd"/>
-      <w:r>
         <w:rPr>
           <w:b/>
           <w:bCs/>
@@ -1872,90 +1783,7 @@
         <w:t>:</w:t>
       </w:r>
       <w:r>
-        <w:t xml:space="preserve"> </w:t>
-      </w:r>
-      <w:r>
-        <w:t xml:space="preserve">nome, CPF, e-mail, </w:t>
-      </w:r>
-      <w:r>
-        <w:t>u</w:t>
-      </w:r>
-      <w:r>
-        <w:t xml:space="preserve">nidade </w:t>
-      </w:r>
-      <w:r>
-        <w:t>g</w:t>
-      </w:r>
-      <w:r>
-        <w:t>estora, foto</w:t>
-      </w:r>
-    </w:p>
-    <w:p>
-      <w:proofErr w:type="spellStart"/>
-      <w:r>
-        <w:rPr>
-          <w:b/>
-          <w:bCs/>
-        </w:rPr>
-        <w:t>usuarioPerfil</w:t>
-      </w:r>
-      <w:proofErr w:type="spellEnd"/>
-      <w:r>
-        <w:rPr>
-          <w:b/>
-          <w:bCs/>
-        </w:rPr>
-        <w:t>:</w:t>
-      </w:r>
-      <w:r>
-        <w:t xml:space="preserve"> </w:t>
-      </w:r>
-      <w:proofErr w:type="spellStart"/>
-      <w:r>
-        <w:t>usuarioServidor</w:t>
-      </w:r>
-      <w:proofErr w:type="spellEnd"/>
-      <w:r>
-        <w:t xml:space="preserve">, perfil, </w:t>
-      </w:r>
-      <w:proofErr w:type="spellStart"/>
-      <w:r>
-        <w:t>descricaoPerfil</w:t>
-      </w:r>
-      <w:proofErr w:type="spellEnd"/>
-    </w:p>
-    <w:p>
-      <w:proofErr w:type="spellStart"/>
-      <w:r>
-        <w:rPr>
-          <w:b/>
-          <w:bCs/>
-        </w:rPr>
-        <w:t>u</w:t>
-      </w:r>
-      <w:r>
-        <w:rPr>
-          <w:b/>
-          <w:bCs/>
-        </w:rPr>
-        <w:t>nidadeGestora</w:t>
-      </w:r>
-      <w:proofErr w:type="spellEnd"/>
-      <w:r>
-        <w:rPr>
-          <w:b/>
-          <w:bCs/>
-        </w:rPr>
-        <w:t>:</w:t>
-      </w:r>
-      <w:r>
-        <w:t xml:space="preserve"> </w:t>
-      </w:r>
-      <w:r>
-        <w:t>Descrição, Responsável, UG principal</w:t>
-      </w:r>
-      <w:r>
-        <w:t xml:space="preserve"> (sim ou não)</w:t>
+        <w:t xml:space="preserve"> Descrição, Responsável, UG principal (sim ou não)</w:t>
       </w:r>
     </w:p>
     <w:p>
@@ -2030,27 +1858,6 @@
     <w:p/>
     <w:p/>
     <w:p/>
-    <w:p>
-      <w:r>
-        <w:t xml:space="preserve">Elabore os </w:t>
-      </w:r>
-      <w:proofErr w:type="spellStart"/>
-      <w:r>
-        <w:t>mockups</w:t>
-      </w:r>
-      <w:proofErr w:type="spellEnd"/>
-      <w:r>
-        <w:t xml:space="preserve"> de acordo com as </w:t>
-      </w:r>
-      <w:proofErr w:type="gramStart"/>
-      <w:r>
-        <w:t>orientações  da</w:t>
-      </w:r>
-      <w:proofErr w:type="gramEnd"/>
-      <w:r>
-        <w:t xml:space="preserve"> sessão "MOCKUP DA PROPOSTA DE SOLUÇÃO", de acordo com a jornada do usuário gerada neste chat e de acordo com as possíveis funcionalidades do sistema, listadas abaixo:</w:t>
-      </w:r>
-    </w:p>
     <w:p/>
     <w:p>
       <w:r>
@@ -2090,7 +1897,6 @@
     </w:p>
     <w:p>
       <w:r>
-        <w:lastRenderedPageBreak/>
         <w:t>Alteração de senha do cidadão</w:t>
       </w:r>
     </w:p>

</xml_diff>